<commit_message>
feat: stage 4 tools with parse/rule/writeback support
</commit_message>
<xml_diff>
--- a/mock/attachments/采购合同2026.docx
+++ b/mock/attachments/采购合同2026.docx
@@ -32,42 +32,47 @@
     </w:p>
     <w:p>
       <w:r>
-        <w:t>第二条 付款条款：合同签订后 10 个工作日内支付预付款 60%；验收合格后 30 日内支付剩余 40%。</w:t>
+        <w:t>第二条 合同期限：本合同自 2026-08-20 起生效，有效期至 2027-08-19。</w:t>
       </w:r>
     </w:p>
     <w:p>
       <w:r>
-        <w:t>第三条 交付条款：乙方应于 2026-12-31 前完成全部货物交付。</w:t>
+        <w:t>第三条 付款条款：合同签订后 10 个工作日内支付预付款 60%；验收合格后 30 日内支付剩余 40%。</w:t>
       </w:r>
     </w:p>
     <w:p>
       <w:r>
-        <w:t>第四条 验收条款：甲方应在乙方交付后 15 个工作日内组织验收，验收标准以双方确认的技术协议为准。</w:t>
+        <w:t>第四条 交付条款：乙方应于 2026-12-31 前完成全部货物交付。</w:t>
       </w:r>
     </w:p>
     <w:p>
       <w:r>
-        <w:t>第五条 违约条款：任何一方违约，应按合同金额的 10% 支付违约金。</w:t>
+        <w:t>第五条 验收条款：甲方应在乙方交付后 15 个工作日内组织验收，验收标准以双方确认的技术协议为准。</w:t>
       </w:r>
     </w:p>
     <w:p>
       <w:r>
-        <w:t>第六条 保密条款：双方应对合同内容及商业秘密承担保密义务，保密期限为合同终止后三年。</w:t>
+        <w:t>第六条 违约条款：任何一方违约，应按合同金额的 10% 支付违约金。</w:t>
       </w:r>
     </w:p>
     <w:p>
       <w:r>
-        <w:t>第七条 数据条款：乙方处理甲方数据应遵守数据安全法及相关规定。</w:t>
+        <w:t>第七条 保密条款：双方应对合同内容及商业秘密承担保密义务，保密期限为合同终止后三年。</w:t>
       </w:r>
     </w:p>
     <w:p>
       <w:r>
-        <w:t>第八条 知识产权条款：软件相关知识产权归甲方所有。</w:t>
+        <w:t>第八条 数据条款：乙方处理甲方数据应遵守数据安全法及相关规定。</w:t>
       </w:r>
     </w:p>
     <w:p>
       <w:r>
-        <w:t>第九条 争议解决条款：双方争议由合同签订地人民法院管辖。</w:t>
+        <w:t>第九条 知识产权条款：软件相关知识产权归甲方所有。</w:t>
+      </w:r>
+    </w:p>
+    <w:p>
+      <w:r>
+        <w:t>第十条 争议解决条款：双方争议由合同签订地人民法院管辖。</w:t>
       </w:r>
     </w:p>
     <w:sectPr>

</xml_diff>